<commit_message>
feat: think on arrival and list each step's actions in the journal
</commit_message>
<xml_diff>
--- a/docs/report/Отчет_ЛР3_Минязов.docx
+++ b/docs/report/Отчет_ЛР3_Минязов.docx
@@ -111,12 +111,6 @@
         <w:gridCol w:w="2835"/>
       </w:tblGrid>
       <w:tr>
-        <w:tblPrEx>
-          <w:tblCellMar>
-            <w:top w:w="0" w:type="dxa"/>
-            <w:bottom w:w="0" w:type="dxa"/>
-          </w:tblCellMar>
-        </w:tblPrEx>
         <w:tc>
           <w:tcPr>
             <w:tcW w:w="3969" w:type="dxa"/>
@@ -163,12 +157,6 @@
         </w:tc>
       </w:tr>
       <w:tr>
-        <w:tblPrEx>
-          <w:tblCellMar>
-            <w:top w:w="0" w:type="dxa"/>
-            <w:bottom w:w="0" w:type="dxa"/>
-          </w:tblCellMar>
-        </w:tblPrEx>
         <w:tc>
           <w:tcPr>
             <w:tcW w:w="3969" w:type="dxa"/>
@@ -222,12 +210,6 @@
         </w:tc>
       </w:tr>
       <w:tr>
-        <w:tblPrEx>
-          <w:tblCellMar>
-            <w:top w:w="0" w:type="dxa"/>
-            <w:bottom w:w="0" w:type="dxa"/>
-          </w:tblCellMar>
-        </w:tblPrEx>
         <w:tc>
           <w:tcPr>
             <w:tcW w:w="3969" w:type="dxa"/>
@@ -270,12 +252,6 @@
         </w:tc>
       </w:tr>
       <w:tr>
-        <w:tblPrEx>
-          <w:tblCellMar>
-            <w:top w:w="0" w:type="dxa"/>
-            <w:bottom w:w="0" w:type="dxa"/>
-          </w:tblCellMar>
-        </w:tblPrEx>
         <w:tc>
           <w:tcPr>
             <w:tcW w:w="3969" w:type="dxa"/>
@@ -322,12 +298,6 @@
         </w:tc>
       </w:tr>
       <w:tr>
-        <w:tblPrEx>
-          <w:tblCellMar>
-            <w:top w:w="0" w:type="dxa"/>
-            <w:bottom w:w="0" w:type="dxa"/>
-          </w:tblCellMar>
-        </w:tblPrEx>
         <w:tc>
           <w:tcPr>
             <w:tcW w:w="3969" w:type="dxa"/>
@@ -431,7 +401,6 @@
         <w:alias w:val="Содержание"/>
         <w:id w:val="1653947154"/>
       </w:sdtPr>
-      <w:sdtEndPr/>
       <w:sdtContent>
         <w:p>
           <w:pPr>
@@ -2476,15 +2445,6 @@
     </w:p>
     <w:p>
       <w:pPr>
-        <w:ind w:firstLine="709"/>
-        <w:jc w:val="both"/>
-      </w:pPr>
-      <w:r>
-        <w:t>Проверка KB ⊨ α сводится к выполнимости: α следует из базы тогда и только тогда, когда формула KB ∧ ¬α невыполнима. Выполнимость проверяется алгоритмом DPLL.</w:t>
-      </w:r>
-    </w:p>
-    <w:p>
-      <w:pPr>
         <w:pStyle w:val="Heading1"/>
         <w:keepNext/>
         <w:pageBreakBefore/>
@@ -2555,12 +2515,6 @@
         <w:gridCol w:w="7371"/>
       </w:tblGrid>
       <w:tr>
-        <w:tblPrEx>
-          <w:tblCellMar>
-            <w:top w:w="0" w:type="dxa"/>
-            <w:bottom w:w="0" w:type="dxa"/>
-          </w:tblCellMar>
-        </w:tblPrEx>
         <w:trPr>
           <w:tblHeader/>
         </w:trPr>
@@ -2634,12 +2588,6 @@
         </w:tc>
       </w:tr>
       <w:tr>
-        <w:tblPrEx>
-          <w:tblCellMar>
-            <w:top w:w="0" w:type="dxa"/>
-            <w:bottom w:w="0" w:type="dxa"/>
-          </w:tblCellMar>
-        </w:tblPrEx>
         <w:trPr>
           <w:cantSplit/>
         </w:trPr>
@@ -2705,12 +2653,6 @@
         </w:tc>
       </w:tr>
       <w:tr>
-        <w:tblPrEx>
-          <w:tblCellMar>
-            <w:top w:w="0" w:type="dxa"/>
-            <w:bottom w:w="0" w:type="dxa"/>
-          </w:tblCellMar>
-        </w:tblPrEx>
         <w:trPr>
           <w:cantSplit/>
         </w:trPr>
@@ -2776,12 +2718,6 @@
         </w:tc>
       </w:tr>
       <w:tr>
-        <w:tblPrEx>
-          <w:tblCellMar>
-            <w:top w:w="0" w:type="dxa"/>
-            <w:bottom w:w="0" w:type="dxa"/>
-          </w:tblCellMar>
-        </w:tblPrEx>
         <w:trPr>
           <w:cantSplit/>
         </w:trPr>
@@ -2847,12 +2783,6 @@
         </w:tc>
       </w:tr>
       <w:tr>
-        <w:tblPrEx>
-          <w:tblCellMar>
-            <w:top w:w="0" w:type="dxa"/>
-            <w:bottom w:w="0" w:type="dxa"/>
-          </w:tblCellMar>
-        </w:tblPrEx>
         <w:trPr>
           <w:cantSplit/>
         </w:trPr>
@@ -2918,12 +2848,6 @@
         </w:tc>
       </w:tr>
       <w:tr>
-        <w:tblPrEx>
-          <w:tblCellMar>
-            <w:top w:w="0" w:type="dxa"/>
-            <w:bottom w:w="0" w:type="dxa"/>
-          </w:tblCellMar>
-        </w:tblPrEx>
         <w:trPr>
           <w:cantSplit/>
         </w:trPr>
@@ -2989,12 +2913,6 @@
         </w:tc>
       </w:tr>
       <w:tr>
-        <w:tblPrEx>
-          <w:tblCellMar>
-            <w:top w:w="0" w:type="dxa"/>
-            <w:bottom w:w="0" w:type="dxa"/>
-          </w:tblCellMar>
-        </w:tblPrEx>
         <w:trPr>
           <w:cantSplit/>
         </w:trPr>
@@ -3060,12 +2978,6 @@
         </w:tc>
       </w:tr>
       <w:tr>
-        <w:tblPrEx>
-          <w:tblCellMar>
-            <w:top w:w="0" w:type="dxa"/>
-            <w:bottom w:w="0" w:type="dxa"/>
-          </w:tblCellMar>
-        </w:tblPrEx>
         <w:trPr>
           <w:cantSplit/>
         </w:trPr>
@@ -3131,12 +3043,6 @@
         </w:tc>
       </w:tr>
       <w:tr>
-        <w:tblPrEx>
-          <w:tblCellMar>
-            <w:top w:w="0" w:type="dxa"/>
-            <w:bottom w:w="0" w:type="dxa"/>
-          </w:tblCellMar>
-        </w:tblPrEx>
         <w:trPr>
           <w:cantSplit/>
         </w:trPr>
@@ -3202,12 +3108,6 @@
         </w:tc>
       </w:tr>
       <w:tr>
-        <w:tblPrEx>
-          <w:tblCellMar>
-            <w:top w:w="0" w:type="dxa"/>
-            <w:bottom w:w="0" w:type="dxa"/>
-          </w:tblCellMar>
-        </w:tblPrEx>
         <w:trPr>
           <w:cantSplit/>
         </w:trPr>
@@ -3273,12 +3173,6 @@
         </w:tc>
       </w:tr>
       <w:tr>
-        <w:tblPrEx>
-          <w:tblCellMar>
-            <w:top w:w="0" w:type="dxa"/>
-            <w:bottom w:w="0" w:type="dxa"/>
-          </w:tblCellMar>
-        </w:tblPrEx>
         <w:trPr>
           <w:cantSplit/>
         </w:trPr>
@@ -3344,12 +3238,6 @@
         </w:tc>
       </w:tr>
       <w:tr>
-        <w:tblPrEx>
-          <w:tblCellMar>
-            <w:top w:w="0" w:type="dxa"/>
-            <w:bottom w:w="0" w:type="dxa"/>
-          </w:tblCellMar>
-        </w:tblPrEx>
         <w:trPr>
           <w:cantSplit/>
         </w:trPr>
@@ -3560,12 +3448,6 @@
         <w:gridCol w:w="5954"/>
       </w:tblGrid>
       <w:tr>
-        <w:tblPrEx>
-          <w:tblCellMar>
-            <w:top w:w="0" w:type="dxa"/>
-            <w:bottom w:w="0" w:type="dxa"/>
-          </w:tblCellMar>
-        </w:tblPrEx>
         <w:trPr>
           <w:tblHeader/>
         </w:trPr>
@@ -3639,12 +3521,6 @@
         </w:tc>
       </w:tr>
       <w:tr>
-        <w:tblPrEx>
-          <w:tblCellMar>
-            <w:top w:w="0" w:type="dxa"/>
-            <w:bottom w:w="0" w:type="dxa"/>
-          </w:tblCellMar>
-        </w:tblPrEx>
         <w:trPr>
           <w:cantSplit/>
         </w:trPr>
@@ -3710,12 +3586,6 @@
         </w:tc>
       </w:tr>
       <w:tr>
-        <w:tblPrEx>
-          <w:tblCellMar>
-            <w:top w:w="0" w:type="dxa"/>
-            <w:bottom w:w="0" w:type="dxa"/>
-          </w:tblCellMar>
-        </w:tblPrEx>
         <w:trPr>
           <w:cantSplit/>
         </w:trPr>
@@ -3781,12 +3651,6 @@
         </w:tc>
       </w:tr>
       <w:tr>
-        <w:tblPrEx>
-          <w:tblCellMar>
-            <w:top w:w="0" w:type="dxa"/>
-            <w:bottom w:w="0" w:type="dxa"/>
-          </w:tblCellMar>
-        </w:tblPrEx>
         <w:trPr>
           <w:cantSplit/>
         </w:trPr>
@@ -3852,12 +3716,6 @@
         </w:tc>
       </w:tr>
       <w:tr>
-        <w:tblPrEx>
-          <w:tblCellMar>
-            <w:top w:w="0" w:type="dxa"/>
-            <w:bottom w:w="0" w:type="dxa"/>
-          </w:tblCellMar>
-        </w:tblPrEx>
         <w:trPr>
           <w:cantSplit/>
         </w:trPr>
@@ -3923,12 +3781,6 @@
         </w:tc>
       </w:tr>
       <w:tr>
-        <w:tblPrEx>
-          <w:tblCellMar>
-            <w:top w:w="0" w:type="dxa"/>
-            <w:bottom w:w="0" w:type="dxa"/>
-          </w:tblCellMar>
-        </w:tblPrEx>
         <w:trPr>
           <w:cantSplit/>
         </w:trPr>
@@ -3994,12 +3846,6 @@
         </w:tc>
       </w:tr>
       <w:tr>
-        <w:tblPrEx>
-          <w:tblCellMar>
-            <w:top w:w="0" w:type="dxa"/>
-            <w:bottom w:w="0" w:type="dxa"/>
-          </w:tblCellMar>
-        </w:tblPrEx>
         <w:trPr>
           <w:cantSplit/>
         </w:trPr>
@@ -4065,12 +3911,6 @@
         </w:tc>
       </w:tr>
       <w:tr>
-        <w:tblPrEx>
-          <w:tblCellMar>
-            <w:top w:w="0" w:type="dxa"/>
-            <w:bottom w:w="0" w:type="dxa"/>
-          </w:tblCellMar>
-        </w:tblPrEx>
         <w:trPr>
           <w:cantSplit/>
         </w:trPr>
@@ -4173,10 +4013,7 @@
         <w:jc w:val="both"/>
       </w:pPr>
       <w:r>
-        <w:t xml:space="preserve">Вопрос «может ли P(3,2) быть истинным» — это проверка выполнимости формулы KB ∧ P(3,2). Её решает алгоритм DPLL: он по очереди задаёт значения переменных, после каждого выводит следствия из предложений, где остался один незаданный литерал (распространение единичных предложений), и при противоречии откатывается. В программе используется DPLL с обучением на конфликтах (CDCL): из противоречия выводится новое предложение — его причина, и откат идёт сразу к решению, которое к ней привело. Простой DPLL с откатом </w:t>
-      </w:r>
-      <w:r>
-        <w:t>на одно решение назад на случайных пещерах 6 × 6 не заканчивал работу: при каждом противоречии он перебирал ямы, не относящиеся к делу.</w:t>
+        <w:t>Вопрос «может ли P(3,2) быть истинным» — это проверка выполнимости формулы KB ∧ P(3,2). Её решает алгоритм DPLL: он по очереди задаёт значения переменных, после каждого выводит следствия из предложений, где остался один незаданный литерал (распространение единичных предложений), и при противоречии откатывается. В программе используется DPLL с обучением на конфликтах (CDCL): из противоречия выводится новое предложение — его причина, и откат идёт сразу к решению, которое к ней привело. Простой DPLL с откатом на одно решение назад на случайных пещерах 6 × 6 не заканчивал работу: при каждом противоречии он перебирал ямы, не относящиеся к делу.</w:t>
       </w:r>
     </w:p>
     <w:p>
@@ -4247,12 +4084,6 @@
         <w:gridCol w:w="1985"/>
       </w:tblGrid>
       <w:tr>
-        <w:tblPrEx>
-          <w:tblCellMar>
-            <w:top w:w="0" w:type="dxa"/>
-            <w:bottom w:w="0" w:type="dxa"/>
-          </w:tblCellMar>
-        </w:tblPrEx>
         <w:trPr>
           <w:tblHeader/>
         </w:trPr>
@@ -4394,12 +4225,6 @@
         </w:tc>
       </w:tr>
       <w:tr>
-        <w:tblPrEx>
-          <w:tblCellMar>
-            <w:top w:w="0" w:type="dxa"/>
-            <w:bottom w:w="0" w:type="dxa"/>
-          </w:tblCellMar>
-        </w:tblPrEx>
         <w:trPr>
           <w:cantSplit/>
         </w:trPr>
@@ -4525,12 +4350,6 @@
         </w:tc>
       </w:tr>
       <w:tr>
-        <w:tblPrEx>
-          <w:tblCellMar>
-            <w:top w:w="0" w:type="dxa"/>
-            <w:bottom w:w="0" w:type="dxa"/>
-          </w:tblCellMar>
-        </w:tblPrEx>
         <w:trPr>
           <w:cantSplit/>
         </w:trPr>
@@ -4656,12 +4475,6 @@
         </w:tc>
       </w:tr>
       <w:tr>
-        <w:tblPrEx>
-          <w:tblCellMar>
-            <w:top w:w="0" w:type="dxa"/>
-            <w:bottom w:w="0" w:type="dxa"/>
-          </w:tblCellMar>
-        </w:tblPrEx>
         <w:trPr>
           <w:cantSplit/>
         </w:trPr>
@@ -4983,12 +4796,6 @@
         <w:gridCol w:w="2268"/>
       </w:tblGrid>
       <w:tr>
-        <w:tblPrEx>
-          <w:tblCellMar>
-            <w:top w:w="0" w:type="dxa"/>
-            <w:bottom w:w="0" w:type="dxa"/>
-          </w:tblCellMar>
-        </w:tblPrEx>
         <w:trPr>
           <w:tblHeader/>
         </w:trPr>
@@ -5130,12 +4937,6 @@
         </w:tc>
       </w:tr>
       <w:tr>
-        <w:tblPrEx>
-          <w:tblCellMar>
-            <w:top w:w="0" w:type="dxa"/>
-            <w:bottom w:w="0" w:type="dxa"/>
-          </w:tblCellMar>
-        </w:tblPrEx>
         <w:trPr>
           <w:cantSplit/>
         </w:trPr>
@@ -5261,12 +5062,6 @@
         </w:tc>
       </w:tr>
       <w:tr>
-        <w:tblPrEx>
-          <w:tblCellMar>
-            <w:top w:w="0" w:type="dxa"/>
-            <w:bottom w:w="0" w:type="dxa"/>
-          </w:tblCellMar>
-        </w:tblPrEx>
         <w:trPr>
           <w:cantSplit/>
         </w:trPr>
@@ -5392,12 +5187,6 @@
         </w:tc>
       </w:tr>
       <w:tr>
-        <w:tblPrEx>
-          <w:tblCellMar>
-            <w:top w:w="0" w:type="dxa"/>
-            <w:bottom w:w="0" w:type="dxa"/>
-          </w:tblCellMar>
-        </w:tblPrEx>
         <w:trPr>
           <w:cantSplit/>
         </w:trPr>
@@ -5534,10 +5323,7 @@
         <w:jc w:val="both"/>
       </w:pPr>
       <w:r>
-        <w:t>Без риска охотник не погибает ни разу. При полной карте почти все пещеры проходимы (99, 99 и 96 %), поэтому проигрыши объясняются не ошибкой в выводе. На больших полях ветерок чувствуется почти везде, и измерений не хватает, чтобы доказать безопасность хотя бы одной новой комнаты: из 231 проигрыша без риска на поле 8 × 8 в 227 охотник ушёл, так и не найдя Вампуса. Логический вывод даёт только достоверные заключения; оценивать, какая из недоказанных комнат опаснее, он не умеет — для этого нужен вероятностный</w:t>
-      </w:r>
-      <w:r>
-        <w:t xml:space="preserve"> вывод, которого задание не требует.</w:t>
+        <w:t>Без риска охотник не погибает ни разу. При полной карте почти все пещеры проходимы (99, 99 и 96 %), поэтому проигрыши объясняются не ошибкой в выводе. На больших полях ветерок чувствуется почти везде, и измерений не хватает, чтобы доказать безопасность хотя бы одной новой комнаты: из 231 проигрыша без риска на поле 8 × 8 в 227 охотник ушёл, так и не найдя Вампуса. Логический вывод даёт только достоверные заключения; оценивать, какая из недоказанных комнат опаснее, он не умеет — для этого нужен вероятностный вывод, которого задание не требует.</w:t>
       </w:r>
     </w:p>
     <w:p>
@@ -5666,6 +5452,9 @@
         <w:keepNext/>
         <w:spacing w:before="240" w:after="120"/>
         <w:ind w:firstLine="709"/>
+        <w:rPr>
+          <w:lang w:val="ru-RU"/>
+        </w:rPr>
       </w:pPr>
       <w:bookmarkStart w:id="13" w:name="_Toc243516486"/>
       <w:r>
@@ -5693,10 +5482,9 @@
         <w:rPr>
           <w:noProof/>
         </w:rPr>
-        <w:lastRenderedPageBreak/>
         <w:drawing>
           <wp:inline distT="0" distB="0" distL="0" distR="0">
-            <wp:extent cx="7620000" cy="4762500"/>
+            <wp:extent cx="7100711" cy="4437944"/>
             <wp:effectExtent l="0" t="0" r="0" b="0"/>
             <wp:docPr id="46367769" name="activity_turn.png" descr="Диаграмма деятельности: шаг вывода охотника" title="Диаграмма деятельности: шаг вывода охотника"/>
             <wp:cNvGraphicFramePr>
@@ -5721,7 +5509,7 @@
                   <pic:spPr bwMode="auto">
                     <a:xfrm>
                       <a:off x="0" y="0"/>
-                      <a:ext cx="7620000" cy="4762500"/>
+                      <a:ext cx="7115420" cy="4447137"/>
                     </a:xfrm>
                     <a:prstGeom prst="rect">
                       <a:avLst/>
@@ -6439,12 +6227,6 @@
         <w:gridCol w:w="7088"/>
       </w:tblGrid>
       <w:tr>
-        <w:tblPrEx>
-          <w:tblCellMar>
-            <w:top w:w="0" w:type="dxa"/>
-            <w:bottom w:w="0" w:type="dxa"/>
-          </w:tblCellMar>
-        </w:tblPrEx>
         <w:trPr>
           <w:tblHeader/>
         </w:trPr>
@@ -6518,12 +6300,6 @@
         </w:tc>
       </w:tr>
       <w:tr>
-        <w:tblPrEx>
-          <w:tblCellMar>
-            <w:top w:w="0" w:type="dxa"/>
-            <w:bottom w:w="0" w:type="dxa"/>
-          </w:tblCellMar>
-        </w:tblPrEx>
         <w:trPr>
           <w:cantSplit/>
         </w:trPr>
@@ -6589,12 +6365,6 @@
         </w:tc>
       </w:tr>
       <w:tr>
-        <w:tblPrEx>
-          <w:tblCellMar>
-            <w:top w:w="0" w:type="dxa"/>
-            <w:bottom w:w="0" w:type="dxa"/>
-          </w:tblCellMar>
-        </w:tblPrEx>
         <w:trPr>
           <w:cantSplit/>
         </w:trPr>
@@ -6660,12 +6430,6 @@
         </w:tc>
       </w:tr>
       <w:tr>
-        <w:tblPrEx>
-          <w:tblCellMar>
-            <w:top w:w="0" w:type="dxa"/>
-            <w:bottom w:w="0" w:type="dxa"/>
-          </w:tblCellMar>
-        </w:tblPrEx>
         <w:trPr>
           <w:cantSplit/>
         </w:trPr>
@@ -6731,12 +6495,6 @@
         </w:tc>
       </w:tr>
       <w:tr>
-        <w:tblPrEx>
-          <w:tblCellMar>
-            <w:top w:w="0" w:type="dxa"/>
-            <w:bottom w:w="0" w:type="dxa"/>
-          </w:tblCellMar>
-        </w:tblPrEx>
         <w:trPr>
           <w:cantSplit/>
         </w:trPr>
@@ -6802,12 +6560,6 @@
         </w:tc>
       </w:tr>
       <w:tr>
-        <w:tblPrEx>
-          <w:tblCellMar>
-            <w:top w:w="0" w:type="dxa"/>
-            <w:bottom w:w="0" w:type="dxa"/>
-          </w:tblCellMar>
-        </w:tblPrEx>
         <w:trPr>
           <w:cantSplit/>
         </w:trPr>
@@ -6873,12 +6625,6 @@
         </w:tc>
       </w:tr>
       <w:tr>
-        <w:tblPrEx>
-          <w:tblCellMar>
-            <w:top w:w="0" w:type="dxa"/>
-            <w:bottom w:w="0" w:type="dxa"/>
-          </w:tblCellMar>
-        </w:tblPrEx>
         <w:trPr>
           <w:cantSplit/>
         </w:trPr>
@@ -6944,12 +6690,6 @@
         </w:tc>
       </w:tr>
       <w:tr>
-        <w:tblPrEx>
-          <w:tblCellMar>
-            <w:top w:w="0" w:type="dxa"/>
-            <w:bottom w:w="0" w:type="dxa"/>
-          </w:tblCellMar>
-        </w:tblPrEx>
         <w:trPr>
           <w:cantSplit/>
         </w:trPr>
@@ -7068,12 +6808,6 @@
         <w:gridCol w:w="7371"/>
       </w:tblGrid>
       <w:tr>
-        <w:tblPrEx>
-          <w:tblCellMar>
-            <w:top w:w="0" w:type="dxa"/>
-            <w:bottom w:w="0" w:type="dxa"/>
-          </w:tblCellMar>
-        </w:tblPrEx>
         <w:trPr>
           <w:tblHeader/>
         </w:trPr>
@@ -7147,12 +6881,6 @@
         </w:tc>
       </w:tr>
       <w:tr>
-        <w:tblPrEx>
-          <w:tblCellMar>
-            <w:top w:w="0" w:type="dxa"/>
-            <w:bottom w:w="0" w:type="dxa"/>
-          </w:tblCellMar>
-        </w:tblPrEx>
         <w:trPr>
           <w:cantSplit/>
         </w:trPr>
@@ -7218,12 +6946,6 @@
         </w:tc>
       </w:tr>
       <w:tr>
-        <w:tblPrEx>
-          <w:tblCellMar>
-            <w:top w:w="0" w:type="dxa"/>
-            <w:bottom w:w="0" w:type="dxa"/>
-          </w:tblCellMar>
-        </w:tblPrEx>
         <w:trPr>
           <w:cantSplit/>
         </w:trPr>
@@ -7290,12 +7012,6 @@
         </w:tc>
       </w:tr>
       <w:tr>
-        <w:tblPrEx>
-          <w:tblCellMar>
-            <w:top w:w="0" w:type="dxa"/>
-            <w:bottom w:w="0" w:type="dxa"/>
-          </w:tblCellMar>
-        </w:tblPrEx>
         <w:trPr>
           <w:cantSplit/>
         </w:trPr>
@@ -7361,12 +7077,6 @@
         </w:tc>
       </w:tr>
       <w:tr>
-        <w:tblPrEx>
-          <w:tblCellMar>
-            <w:top w:w="0" w:type="dxa"/>
-            <w:bottom w:w="0" w:type="dxa"/>
-          </w:tblCellMar>
-        </w:tblPrEx>
         <w:trPr>
           <w:cantSplit/>
         </w:trPr>
@@ -7456,10 +7166,7 @@
         <w:jc w:val="both"/>
       </w:pPr>
       <w:r>
-        <w:t xml:space="preserve">Главное окно (класс WumpusApp) показывает две карты: слева — настоящую пещеру со значками ям, Вампуса, золота и подсказками датчиков (запах, ветерок, блеск), справа — то, что знает охотник: посещённые комнаты серые, пометки OK, P?, P!, W?, W!, G?, G! — как в таблицах задания. Пометка «может быть» ставится только рядом с комнатой, где почувствовали ветерок, запах или блеск, иначе она стояла бы почти в каждой неизвестной комнате. Охотник нарисован на обеих картах, красная стрелка показывает, куда он смотрит. </w:t>
-      </w:r>
-      <w:r>
-        <w:t>Справа — состояние игры, внизу — журнал шагов в формате задания (таблица 7).</w:t>
+        <w:t>Главное окно (класс WumpusApp) показывает две карты: слева — настоящую пещеру со значками ям, Вампуса, золота и подсказками датчиков (запах, ветерок, блеск), справа — то, что знает охотник: посещённые комнаты серые, пометки OK, P?, P!, W?, W!, G?, G! — как в таблицах задания. Пометка «может быть» ставится только рядом с комнатой, где почувствовали ветерок, запах или блеск, иначе она стояла бы почти в каждой неизвестной комнате. Охотник нарисован на обеих картах, красная стрелка показывает, куда он смотрит. Справа — состояние игры, внизу — журнал шагов в формате задания (таблица 7).</w:t>
       </w:r>
     </w:p>
     <w:p>
@@ -7497,12 +7204,6 @@
         <w:gridCol w:w="6804"/>
       </w:tblGrid>
       <w:tr>
-        <w:tblPrEx>
-          <w:tblCellMar>
-            <w:top w:w="0" w:type="dxa"/>
-            <w:bottom w:w="0" w:type="dxa"/>
-          </w:tblCellMar>
-        </w:tblPrEx>
         <w:trPr>
           <w:tblHeader/>
         </w:trPr>
@@ -7576,12 +7277,6 @@
         </w:tc>
       </w:tr>
       <w:tr>
-        <w:tblPrEx>
-          <w:tblCellMar>
-            <w:top w:w="0" w:type="dxa"/>
-            <w:bottom w:w="0" w:type="dxa"/>
-          </w:tblCellMar>
-        </w:tblPrEx>
         <w:trPr>
           <w:cantSplit/>
         </w:trPr>
@@ -7647,12 +7342,6 @@
         </w:tc>
       </w:tr>
       <w:tr>
-        <w:tblPrEx>
-          <w:tblCellMar>
-            <w:top w:w="0" w:type="dxa"/>
-            <w:bottom w:w="0" w:type="dxa"/>
-          </w:tblCellMar>
-        </w:tblPrEx>
         <w:trPr>
           <w:cantSplit/>
         </w:trPr>
@@ -7718,12 +7407,6 @@
         </w:tc>
       </w:tr>
       <w:tr>
-        <w:tblPrEx>
-          <w:tblCellMar>
-            <w:top w:w="0" w:type="dxa"/>
-            <w:bottom w:w="0" w:type="dxa"/>
-          </w:tblCellMar>
-        </w:tblPrEx>
         <w:trPr>
           <w:cantSplit/>
         </w:trPr>
@@ -7789,12 +7472,6 @@
         </w:tc>
       </w:tr>
       <w:tr>
-        <w:tblPrEx>
-          <w:tblCellMar>
-            <w:top w:w="0" w:type="dxa"/>
-            <w:bottom w:w="0" w:type="dxa"/>
-          </w:tblCellMar>
-        </w:tblPrEx>
         <w:trPr>
           <w:cantSplit/>
         </w:trPr>
@@ -7860,12 +7537,6 @@
         </w:tc>
       </w:tr>
       <w:tr>
-        <w:tblPrEx>
-          <w:tblCellMar>
-            <w:top w:w="0" w:type="dxa"/>
-            <w:bottom w:w="0" w:type="dxa"/>
-          </w:tblCellMar>
-        </w:tblPrEx>
         <w:trPr>
           <w:cantSplit/>
         </w:trPr>
@@ -7931,12 +7602,6 @@
         </w:tc>
       </w:tr>
       <w:tr>
-        <w:tblPrEx>
-          <w:tblCellMar>
-            <w:top w:w="0" w:type="dxa"/>
-            <w:bottom w:w="0" w:type="dxa"/>
-          </w:tblCellMar>
-        </w:tblPrEx>
         <w:trPr>
           <w:cantSplit/>
         </w:trPr>
@@ -8002,12 +7667,6 @@
         </w:tc>
       </w:tr>
       <w:tr>
-        <w:tblPrEx>
-          <w:tblCellMar>
-            <w:top w:w="0" w:type="dxa"/>
-            <w:bottom w:w="0" w:type="dxa"/>
-          </w:tblCellMar>
-        </w:tblPrEx>
         <w:trPr>
           <w:cantSplit/>
         </w:trPr>
@@ -8073,12 +7732,6 @@
         </w:tc>
       </w:tr>
       <w:tr>
-        <w:tblPrEx>
-          <w:tblCellMar>
-            <w:top w:w="0" w:type="dxa"/>
-            <w:bottom w:w="0" w:type="dxa"/>
-          </w:tblCellMar>
-        </w:tblPrEx>
         <w:trPr>
           <w:cantSplit/>
         </w:trPr>
@@ -8156,10 +7809,7 @@
       </w:pPr>
       <w:r>
         <w:lastRenderedPageBreak/>
-        <w:t>Непрерывная игра реализована таймером JavaFX AnimationTimer, который вызывается при каждой перерисовке экрана. Контроллер накапливает прошедшее время, умноженное на скорость, и выполняет столько действий, сколько накопилось; время на паузе не превращается в действия, а после долгого «замерзания» окна учитывается не больше секунды. Окно проверено при размерах от минимального 900 × 620 до полноэкранного и на пещерах до 12 × 12: панель состояния в низком окне прокручивается, в мелких клетках не пишутся координ</w:t>
-      </w:r>
-      <w:r>
-        <w:t>аты.</w:t>
+        <w:t>Непрерывная игра реализована таймером JavaFX AnimationTimer, который вызывается при каждой перерисовке экрана. Контроллер накапливает прошедшее время, умноженное на скорость, и выполняет столько действий, сколько накопилось; время на паузе не превращается в действия, а после долгого «замерзания» окна учитывается не больше секунды. Окно проверено при размерах от минимального 900 × 620 до полноэкранного и на пещерах до 12 × 12: панель состояния в низком окне прокручивается, в мелких клетках не пишутся координаты.</w:t>
       </w:r>
     </w:p>
     <w:p>
@@ -8862,10 +8512,7 @@
         <w:jc w:val="both"/>
       </w:pPr>
       <w:r>
-        <w:t>В ходе лабораторной работы разработана программа «Мир Вампуса», в которой охотник действует как агент, основанный на знаниях. Охотник не видит карту: правила мира и показания датчиков он записывает в базу знаний в виде предложений пропозициональной логики, а безопасность комнат, положение ям, Вампуса и золота выводит проверкой логического следования с помощью алгоритма DPLL. Вывод объединяет знания, полученные на разных шагах; программа повторяет пример из задания и показывает представление агента на каждом</w:t>
-      </w:r>
-      <w:r>
-        <w:t xml:space="preserve"> шаге.</w:t>
+        <w:t>В ходе лабораторной работы разработана программа «Мир Вампуса», в которой охотник действует как агент, основанный на знаниях. Охотник не видит карту: правила мира и показания датчиков он записывает в базу знаний в виде предложений пропозициональной логики, а безопасность комнат, положение ям, Вампуса и золота выводит проверкой логического следования с помощью алгоритма DPLL. Вывод объединяет знания, полученные на разных шагах; программа повторяет пример из задания и показывает представление агента на каждом шаге.</w:t>
       </w:r>
     </w:p>
     <w:p>
@@ -35903,39 +35550,7 @@
           <w:sz w:val="17"/>
           <w:szCs w:val="17"/>
         </w:rPr>
-        <w:t xml:space="preserve">    /** Только ASCII-цифры, необязательный знак: «</w:t>
-      </w:r>
-      <w:r>
-        <w:rPr>
-          <w:rFonts w:ascii="Courier New" w:eastAsia="Courier New" w:hAnsi="Courier New" w:cs="Courier New"/>
-          <w:sz w:val="17"/>
-          <w:szCs w:val="17"/>
-        </w:rPr>
-        <w:t>５</w:t>
-      </w:r>
-      <w:r>
-        <w:rPr>
-          <w:rFonts w:ascii="Courier New" w:eastAsia="Courier New" w:hAnsi="Courier New" w:cs="Courier New"/>
-          <w:sz w:val="17"/>
-          <w:szCs w:val="17"/>
-        </w:rPr>
-        <w:t>» или «</w:t>
-      </w:r>
-      <w:r>
-        <w:rPr>
-          <w:rFonts w:ascii="Courier New" w:eastAsia="Courier New" w:hAnsi="Courier New" w:cs="Courier New"/>
-          <w:sz w:val="17"/>
-          <w:szCs w:val="17"/>
-        </w:rPr>
-        <w:t>٣</w:t>
-      </w:r>
-      <w:r>
-        <w:rPr>
-          <w:rFonts w:ascii="Courier New" w:eastAsia="Courier New" w:hAnsi="Courier New" w:cs="Courier New"/>
-          <w:sz w:val="17"/>
-          <w:szCs w:val="17"/>
-        </w:rPr>
-        <w:t>» числом не считаются. */</w:t>
+        <w:t xml:space="preserve">    /** Только ASCII-цифры, необязательный знак: «５» или «٣» числом не считаются. */</w:t>
       </w:r>
     </w:p>
     <w:p>
@@ -50300,7 +49915,15 @@
         <w:sz w:val="24"/>
         <w:szCs w:val="24"/>
       </w:rPr>
-      <w:t>11</w:t>
+      <w:t>1</w:t>
+    </w:r>
+    <w:r>
+      <w:rPr>
+        <w:noProof/>
+        <w:sz w:val="24"/>
+        <w:szCs w:val="24"/>
+      </w:rPr>
+      <w:t>1</w:t>
     </w:r>
     <w:r>
       <w:rPr>
@@ -50346,7 +49969,15 @@
         <w:sz w:val="24"/>
         <w:szCs w:val="24"/>
       </w:rPr>
-      <w:t>13</w:t>
+      <w:t>1</w:t>
+    </w:r>
+    <w:r>
+      <w:rPr>
+        <w:noProof/>
+        <w:sz w:val="24"/>
+        <w:szCs w:val="24"/>
+      </w:rPr>
+      <w:t>3</w:t>
     </w:r>
     <w:r>
       <w:rPr>

</xml_diff>